<commit_message>
Use the slides' bigram dictionary in the notebook
The bigram dictionary is now the one built on round 1 of the coded
sample (as on the slides), not the hand-picked list. Terms are unigrams,
bigrams and hand coding throughout. Step 3b examples are table, fresh,
coming, quality and friendly. Notebook re-run in Colab.

Adds data/coded_samples_300.csv (the two coded samples) and updates the
Gemini prompt list to match.

Co-Authored-By: Claude Opus 5.5 <noreply@anthropic.com>
</commit_message>
<xml_diff>
--- a/EMEA_CHRIE_Gemini_Prompts.docx
+++ b/EMEA_CHRIE_Gemini_Prompts.docx
@@ -93,7 +93,7 @@
         <w:rPr>
           <w:b/>
         </w:rPr>
-        <w:t>Step 3b. Word pairs (bigrams) keep the context</w:t>
+        <w:t>Step 3b. Bigrams keep the context</w:t>
       </w:r>
     </w:p>
     <w:p>
@@ -102,7 +102,7 @@
         <w:ind w:left="216"/>
       </w:pPr>
       <w:r>
-        <w:t>Remove stop words and count every pair of neighboring words, weighted by how often each sentence is written. Show the 15 most frequent pairs. Then, for the keywords forgettable, table, fresh, coming and wonderful, show their pairs and how often each was written.</w:t>
+        <w:t>Remove stop words and count every bigram (two neighboring words), weighted by how often each sentence is written. Show the 15 most frequent bigrams. Then, for the keywords table, fresh, coming, quality and friendly, show their bigrams and how often each was written.</w:t>
       </w:r>
     </w:p>
     <w:p>
@@ -114,7 +114,7 @@
         <w:rPr>
           <w:b/>
         </w:rPr>
-        <w:t>Step 3b. Word pairs (bigrams) keep the context, the word-pair dictionary</w:t>
+        <w:t>Step 3b. Bigrams keep the context, the bigram dictionary</w:t>
       </w:r>
     </w:p>
     <w:p>
@@ -123,7 +123,7 @@
         <w:ind w:left="216"/>
       </w:pPr>
       <w:r>
-        <w:t>Make a word-pair version of the dictionary. Drop these ambiguous keywords: forgettable, fresh, table, coming, celebration, portion, generous, stingy, tiny, satisfying, quality, wonderful. Count them only inside these pairs. Food: bland forgettable, high quality. Service: ignored table, table turnover, five minutes. Atmosphere: clean tables, table sticky, fresh restrooms. Satisfaction: forgettable dreary, wonderful celebration, regretted coming. Revisit: coming back. Then list the sentences whose constructs change, with how often each is written.</w:t>
+        <w:t>Make a bigram version of the dictionary. Drop these ambiguous keywords: celebration, coming, forgettable, fresh, generous, portion, quality, table, wonderful. Count them only inside these bigrams. Food: bland forgettable, fresh high, generous satisfying, high quality, quality ingredients, satisfying portions, stingy portions. Service: efficient table, ignored table, table turnover. Atmosphere: clean tables, fresh restrooms, immaculate fresh, table sticky, tables floors. Satisfaction: forgettable dreary, regretted coming, wonderful celebration. Revisit: coming back, definitely coming. Then list the sentences whose constructs change, with how often each is written.</w:t>
       </w:r>
     </w:p>
     <w:p>
@@ -214,7 +214,7 @@
         <w:ind w:left="216"/>
       </w:pPr>
       <w:r>
-        <w:t>For every distinct sentence and every construct found in it, take the first matching keyword that is a noun, or the first keyword if none is, and use the Hugging Face model yangheng/deberta-v3-base-absa-v1.1 to judge the sentiment toward that word. Do this for both dictionaries. Add the score P(positive) minus P(negative) and the most likely label.</w:t>
+        <w:t>For every distinct sentence and every construct found in it, take the first matching keyword that is a noun, or the first keyword if none is, and use the Hugging Face model yangheng/deberta-v3-base-absa-v1.1 to judge the sentiment toward that word. Do this for both dictionaries (unigrams and bigrams). Add the score P(positive) minus P(negative) and the most likely label.</w:t>
       </w:r>
     </w:p>
     <w:p>
@@ -226,7 +226,7 @@
         <w:rPr>
           <w:b/>
         </w:rPr>
-        <w:t>Step 5. Do not trust AI output blindly: check both steps against a human-coded sample</w:t>
+        <w:t>Step 5. Do not trust AI output blindly: check both steps against a hand-coded sample</w:t>
       </w:r>
     </w:p>
     <w:p>
@@ -235,7 +235,7 @@
         <w:ind w:left="216"/>
       </w:pPr>
       <w:r>
-        <w:t>Using reference_coding_150.csv, report for each dictionary how many sentences (weighted by times written) were assigned to the wrong construct. Then compare the VADER, Gemini and ABSA labels with the human polarity, on the sentence-construct pairs that the human code confirms. Report percent agreement and Cohen's kappa.</w:t>
+        <w:t>Using reference_coding_150.csv, report for each dictionary (unigrams and bigrams) how many sentences (weighted by times written) were assigned to the wrong construct. Then compare the VADER, Gemini and ABSA labels with the hand-coded polarity, on the sentence-construct pairs that the hand coding confirms. Report percent agreement and Cohen's kappa.</w:t>
       </w:r>
     </w:p>
     <w:p>
@@ -256,7 +256,7 @@
         <w:ind w:left="216"/>
       </w:pPr>
       <w:r>
-        <w:t>For each review and construct, average the sentence scores. Do this for: single words with VADER (the book), single words with the ABSA score, word pairs with the ABSA score, word pairs with the Gemini label (+1, 0, -1), and the human code. Add the overall VADER score of the whole review.</w:t>
+        <w:t>For each review and construct, average the sentence scores. Do this for: unigrams with VADER (the book), unigrams with the ABSA score, bigrams with the ABSA score, bigrams with the Gemini label (+1, 0, -1), and the hand coding. Add the overall VADER score of the whole review.</w:t>
       </w:r>
     </w:p>
     <w:p>

</xml_diff>